<commit_message>
Bring REVISED master current with latest template edits
Synced the shared/legal content of the REVISED master to match the
updated HOURLY template: email-confirmable amendment wording (all three
clauses), restacked cover proof points, Section 1/2 labels, removed the
governance-group placeholder line, and the new $200k/$150k/$100k +
90-day employment terms. Preserved REVISED's dual fee section (both the
hourly rate card and the fixed-fee block) as the master superset.

Co-Authored-By: Claude Opus 4.8 <noreply@anthropic.com>
Claude-Session: https://claude.ai/code/session_01RfN2m1kgBo1xCWLXRNw2zV
</commit_message>
<xml_diff>
--- a/Onyx_Engagement_Letter_REVISED.docx
+++ b/Onyx_Engagement_Letter_REVISED.docx
@@ -270,10 +270,37 @@
     <w:p>
       <w:pPr>
         <w:pStyle w:val="CLAProNormalNoSpaceAfter"/>
-        <w:ind w:left="4140"/>
-      </w:pPr>
-      <w:r>
-        <w:t xml:space="preserve">Day-to-day bookkeeping   ·   Controller-level oversight   ·   Cash-flow management   ·   Always-on advisory</w:t>
+        <w:ind w:left="4140" w:hanging="4590"/>
+      </w:pPr>
+      <w:r>
+        <w:t xml:space="preserve">·   Bookkeeping support</w:t>
+      </w:r>
+    </w:p>
+    <w:p>
+      <w:pPr>
+        <w:pStyle w:val="CLAProNormalNoSpaceAfter"/>
+        <w:ind w:left="4140" w:hanging="4590"/>
+      </w:pPr>
+      <w:r>
+        <w:t xml:space="preserve">·   Controller-level oversight</w:t>
+      </w:r>
+    </w:p>
+    <w:p>
+      <w:pPr>
+        <w:pStyle w:val="CLAProNormalNoSpaceAfter"/>
+        <w:ind w:left="4140" w:hanging="4590"/>
+      </w:pPr>
+      <w:r>
+        <w:t xml:space="preserve">·   Review &amp; audit readiness</w:t>
+      </w:r>
+    </w:p>
+    <w:p>
+      <w:pPr>
+        <w:pStyle w:val="CLAProNormalNoSpaceAfter"/>
+        <w:ind w:left="4140" w:hanging="4590"/>
+      </w:pPr>
+      <w:r>
+        <w:t xml:space="preserve">·   CFO Level Advisory</w:t>
       </w:r>
     </w:p>
     <w:p>
@@ -422,78 +449,6 @@
         <w:pStyle w:val="CLALTRAddressorSignature"/>
       </w:pPr>
       <w:r>
-        <w:rPr>
-          <w:highlight w:val="yellow"/>
-        </w:rPr>
-        <w:fldChar w:fldCharType="begin">
-          <w:ffData>
-            <w:name w:val="Text36"/>
-            <w:enabled/>
-            <w:calcOnExit w:val="0"/>
-            <w:textInput>
-              <w:default w:val="[Insert Governance Group Name]"/>
-            </w:textInput>
-          </w:ffData>
-        </w:fldChar>
-      </w:r>
-      <w:r>
-        <w:rPr>
-          <w:highlight w:val="yellow"/>
-        </w:rPr>
-        <w:instrText xml:space="preserve"> FORMTEXT </w:instrText>
-      </w:r>
-      <w:r>
-        <w:rPr>
-          <w:highlight w:val="yellow"/>
-        </w:rPr>
-      </w:r>
-      <w:r>
-        <w:rPr>
-          <w:highlight w:val="yellow"/>
-        </w:rPr>
-        <w:fldChar w:fldCharType="separate"/>
-      </w:r>
-      <w:r>
-        <w:rPr>
-          <w:noProof/>
-          <w:highlight w:val="yellow"/>
-        </w:rPr>
-        <w:t>[Insert Governance Group Name]</w:t>
-      </w:r>
-      <w:r>
-        <w:rPr>
-          <w:highlight w:val="yellow"/>
-        </w:rPr>
-        <w:fldChar w:fldCharType="end"/>
-      </w:r>
-      <w:bookmarkEnd w:id="1"/>
-      <w:r>
-        <w:rPr>
-          <w:highlight w:val="yellow"/>
-        </w:rPr>
-        <w:t xml:space="preserve"> and</w:t>
-      </w:r>
-      <w:r>
-        <w:t xml:space="preserve"> Management</w:t>
-      </w:r>
-      <w:r>
-        <w:rPr>
-          <w:rStyle w:val="CLALTRHiddenTextChar"/>
-        </w:rPr>
-        <w:t xml:space="preserve"> </w:t>
-      </w:r>
-      <w:r>
-        <w:rPr>
-          <w:rStyle w:val="CLALTRHiddenTextChar"/>
-        </w:rPr>
-        <w:t xml:space="preserve">   </w:t>
-      </w:r>
-    </w:p>
-    <w:p>
-      <w:pPr>
-        <w:pStyle w:val="CLALTRAddressorSignature"/>
-      </w:pPr>
-      <w:r>
         <w:fldChar w:fldCharType="begin">
           <w:ffData>
             <w:name w:val="Text46"/>
@@ -880,7 +835,7 @@
         <w:rPr>
           <w:b/>
         </w:rPr>
-        <w:t>signed by both ONYX and the Client</w:t>
+        <w:t>including by email, agreed to by both ONYX and the Client</w:t>
       </w:r>
       <w:r>
         <w:t>.</w:t>
@@ -889,9 +844,31 @@
     <w:p>
       <w:pPr>
         <w:pStyle w:val="CLALTRHeading1"/>
-        <w:jc w:val="both"/>
-      </w:pPr>
-      <w:r>
+        <w:pBdr>
+          <w:top w:val="single" w:sz="8" w:space="10" w:color="auto"/>
+          <w:bottom w:val="single" w:sz="8" w:space="10" w:color="auto"/>
+        </w:pBdr>
+        <w:spacing w:before="240" w:after="200"/>
+        <w:jc w:val="both"/>
+      </w:pPr>
+      <w:r>
+        <w:rPr>
+          <w:caps/>
+          <w:color w:val="7F7F7F"/>
+          <w:sz w:val="18"/>
+          <w:szCs w:val="18"/>
+          <w:spacing w:val="60"/>
+        </w:rPr>
+        <w:t xml:space="preserve">Section 1</w:t>
+      </w:r>
+      <w:r>
+        <w:br/>
+      </w:r>
+      <w:r>
+        <w:rPr>
+          <w:sz w:val="48"/>
+          <w:szCs w:val="48"/>
+        </w:rPr>
         <w:t xml:space="preserve">What we’ll do for you</w:t>
       </w:r>
     </w:p>
@@ -1783,7 +1760,7 @@
         <w:jc w:val="both"/>
       </w:pPr>
       <w:r>
-        <w:t xml:space="preserve">Your needs will evolve as your business grows, and this engagement is built to flex with them. Services can be added, reduced, or adjusted at any time by mutual written agreement — typically a brief addendum to this letter rather than a new engagement letter — with fees adjusted accordingly. All other terms of this agreement remain in effect, so adding or removing a service never requires starting over.</w:t>
+        <w:t>Your needs will evolve as your business grows, and this engagement is built to flex with them. Services can be added, reduced, or adjusted at any time by mutual written agreement — including by email, with no formal addendum or new engagement letter required. All other terms of this agreement remain in effect, so adding or removing a service never requires starting over.</w:t>
       </w:r>
     </w:p>
     <w:p>
@@ -3872,7 +3849,7 @@
         <w:jc w:val="both"/>
       </w:pPr>
       <w:r>
-        <w:t xml:space="preserve">To ensure that ONYX’s services remain responsive to the Client’s needs, and fair to both parties, ONYX will meet with the Client throughout the term of this agreement and, as needs change, revise or adjust the scope of services and the related fees — without the need to re-execute this agreement. Such revisions or adjustments are not binding unless made in writing and signed by both ONYX and the Client.</w:t>
+        <w:t>To ensure that ONYX’s services remain responsive to the Client’s needs, and fair to both parties, ONYX will meet with the Client throughout the term of this agreement and, as needs change, revise or adjust the scope of services and the related fees — without the need to re-execute this agreement. Such revisions or adjustments take effect once confirmed in writing, including by email, by both ONYX and the Client; no signature, formal addendum, or re-execution of this agreement is required.</w:t>
       </w:r>
     </w:p>
     <w:p>
@@ -3914,9 +3891,31 @@
       <w:pPr>
         <w:pStyle w:val="CLALTRHeading1"/>
         <w:pageBreakBefore/>
-        <w:jc w:val="both"/>
-      </w:pPr>
-      <w:r>
+        <w:pBdr>
+          <w:top w:val="single" w:sz="8" w:space="10" w:color="auto"/>
+          <w:bottom w:val="single" w:sz="8" w:space="10" w:color="auto"/>
+        </w:pBdr>
+        <w:spacing w:before="240" w:after="200"/>
+        <w:jc w:val="both"/>
+      </w:pPr>
+      <w:r>
+        <w:rPr>
+          <w:caps/>
+          <w:color w:val="7F7F7F"/>
+          <w:sz w:val="18"/>
+          <w:szCs w:val="18"/>
+          <w:spacing w:val="60"/>
+        </w:rPr>
+        <w:t xml:space="preserve">Section 2</w:t>
+      </w:r>
+      <w:r>
+        <w:br/>
+      </w:r>
+      <w:r>
+        <w:rPr>
+          <w:sz w:val="48"/>
+          <w:szCs w:val="48"/>
+        </w:rPr>
         <w:t xml:space="preserve">Terms and Conditions</w:t>
       </w:r>
     </w:p>
@@ -5009,100 +5008,19 @@
         <w:jc w:val="both"/>
       </w:pPr>
       <w:r>
-        <w:t xml:space="preserve">The </w:t>
-      </w:r>
-      <w:r>
-        <w:t xml:space="preserve">Client </w:t>
-      </w:r>
-      <w:r>
-        <w:t xml:space="preserve">will be required to pay an employment fee of </w:t>
-      </w:r>
-      <w:r>
-        <w:rPr>
-          <w:highlight w:val="yellow"/>
-        </w:rPr>
-        <w:t>$60,000 for the controller and $25,000 for the staff</w:t>
-      </w:r>
-      <w:r>
-        <w:t xml:space="preserve"> to </w:t>
-      </w:r>
-      <w:r>
-        <w:t>ONYX</w:t>
-      </w:r>
-      <w:r>
-        <w:t xml:space="preserve"> immediately upon receipt of this notice.</w:t>
-      </w:r>
-    </w:p>
-    <w:p>
-      <w:pPr>
-        <w:pStyle w:val="CLALTRNormal"/>
-        <w:jc w:val="both"/>
-      </w:pPr>
-      <w:r>
-        <w:t xml:space="preserve">If any former </w:t>
-      </w:r>
-      <w:r>
-        <w:t>ONYX</w:t>
-      </w:r>
-      <w:r>
-        <w:t xml:space="preserve"> employee shall be hired as an employee</w:t>
-      </w:r>
-      <w:r>
-        <w:t xml:space="preserve"> of the </w:t>
+        <w:t>The Client will be required to pay an employment fee of $200,000 for the CFO, $150,000 for the controller, and $100,000 for the staff to ONYX immediately upon receipt of this notice.</w:t>
+      </w:r>
+    </w:p>
+    <w:p>
+      <w:pPr>
+        <w:pStyle w:val="CLALTRNormal"/>
+        <w:jc w:val="both"/>
+      </w:pPr>
+      <w:r>
+        <w:t>If any former ONYX employee shall be hired as an employee of the Client within ninety (90) days of leaving ONYX, there shall be a rebuttable presumption that the ONYX employee was solicited to work as an employee of the Client, and the above fee shall be payable to ONYX from the Client.</w:t>
       </w:r>
       <w:proofErr w:type="spellStart"/>
-      <w:r>
-        <w:t>Client</w:t>
-      </w:r>
       <w:proofErr w:type="spellEnd"/>
-      <w:r>
-        <w:t xml:space="preserve"> within</w:t>
-      </w:r>
-      <w:r>
-        <w:t xml:space="preserve"> sixty</w:t>
-      </w:r>
-      <w:r>
-        <w:t xml:space="preserve"> </w:t>
-      </w:r>
-      <w:r>
-        <w:t>(</w:t>
-      </w:r>
-      <w:r>
-        <w:t>60</w:t>
-      </w:r>
-      <w:r>
-        <w:t>)</w:t>
-      </w:r>
-      <w:r>
-        <w:t xml:space="preserve"> days of leaving </w:t>
-      </w:r>
-      <w:r>
-        <w:t>ONYX</w:t>
-      </w:r>
-      <w:r>
-        <w:t xml:space="preserve">, there shall be a rebuttable presumption that the </w:t>
-      </w:r>
-      <w:r>
-        <w:t>ONYX</w:t>
-      </w:r>
-      <w:r>
-        <w:t xml:space="preserve"> employee was solicited to work as an employee of the </w:t>
-      </w:r>
-      <w:r>
-        <w:t xml:space="preserve">Client, </w:t>
-      </w:r>
-      <w:r>
-        <w:t xml:space="preserve">and the above fee shall be payable to </w:t>
-      </w:r>
-      <w:r>
-        <w:t>ONYX</w:t>
-      </w:r>
-      <w:r>
-        <w:t xml:space="preserve"> from the Client</w:t>
-      </w:r>
-      <w:r>
-        <w:t>.</w:t>
-      </w:r>
     </w:p>
     <w:p>
       <w:pPr>

</xml_diff>